<commit_message>
Ajout de la documentation au format PDF
</commit_message>
<xml_diff>
--- a/Tout savoir sur mon App BKN Patoche.docx
+++ b/Tout savoir sur mon App BKN Patoche.docx
@@ -2198,6 +2198,7 @@
         <w:rPr>
           <w:b/>
           <w:bCs/>
+          <w:noProof/>
         </w:rPr>
         <w:drawing>
           <wp:inline distT="0" distB="0" distL="0" distR="0" wp14:anchorId="1B26AA31" wp14:editId="17EDA442">
@@ -3082,6 +3083,65 @@
     <w:p>
       <w:r>
         <w:t>curl http://localhost:8001/health</w:t>
+      </w:r>
+    </w:p>
+    <w:p/>
+    <w:p>
+      <w:r>
+        <w:t>MISE A JOUR - AVRIL 2026</w:t>
+      </w:r>
+    </w:p>
+    <w:p>
+      <w:r>
+        <w:t>Cette section ajoute des informations complementaires sans modifier le contenu existant.</w:t>
+      </w:r>
+    </w:p>
+    <w:p/>
+    <w:p>
+      <w:r>
+        <w:t>- Nouveautes de documentation :</w:t>
+      </w:r>
+    </w:p>
+    <w:p>
+      <w:r>
+        <w:t xml:space="preserve">  • README principal enrichi (architecture, endpoints, dependances, deploiement).</w:t>
+      </w:r>
+    </w:p>
+    <w:p>
+      <w:r>
+        <w:t xml:space="preserve">  • Dossier infrastructure documente : schema SQL, seed SQL, guides Render et Supabase.</w:t>
+      </w:r>
+    </w:p>
+    <w:p>
+      <w:r>
+        <w:t xml:space="preserve">  • Guide d'installation backend/mobile clarifie pour tests locaux Docker et execution Android.</w:t>
+      </w:r>
+    </w:p>
+    <w:p/>
+    <w:p>
+      <w:r>
+        <w:t>- Etat technique actuel :</w:t>
+      </w:r>
+    </w:p>
+    <w:p>
+      <w:r>
+        <w:t xml:space="preserve">  • Backend : FastAPI + PostgreSQL (Supabase, pooler 6543, SSL). </w:t>
+      </w:r>
+    </w:p>
+    <w:p>
+      <w:r>
+        <w:t xml:space="preserve">  • Mobile : Flutter Android, scan/paiement QR, portefeuille BKN, crypto et chatbot Felicite.</w:t>
+      </w:r>
+    </w:p>
+    <w:p>
+      <w:r>
+        <w:t xml:space="preserve">  • Securite : bcrypt, gestion des sessions, options biometrie et 2FA cote application.</w:t>
+      </w:r>
+    </w:p>
+    <w:p/>
+    <w:p>
+      <w:r>
+        <w:t>- Note : le contenu d'origine, les images deja presentes et les espacements ont ete conserves.</w:t>
       </w:r>
     </w:p>
     <w:sectPr>
@@ -3746,6 +3806,7 @@
   <w:style w:type="character" w:default="1" w:styleId="Policepardfaut">
     <w:name w:val="Default Paragraph Font"/>
     <w:uiPriority w:val="1"/>
+    <w:semiHidden/>
     <w:unhideWhenUsed/>
   </w:style>
   <w:style w:type="table" w:default="1" w:styleId="TableauNormal">

</xml_diff>